<commit_message>
Many think homepage coordinator
</commit_message>
<xml_diff>
--- a/docs/training/FORM 3 - Client Funding Agreement.docx
+++ b/docs/training/FORM 3 - Client Funding Agreement.docx
@@ -787,35 +787,7 @@
                 <w:szCs w:val="16"/>
                 <w:lang w:val="en-US"/>
               </w:rPr>
-              <w:t xml:space="preserve">** Payment of Tuition-related expenses will be paid to the Educational/Training institution named </w:t>
-            </w:r>
-            <w:proofErr w:type="gramStart"/>
-            <w:r>
-              <w:rPr>
-                <w:rFonts w:ascii="Calibri" w:hAnsi="Calibri" w:cs="Calibri"/>
-                <w:b/>
-                <w:bCs/>
-                <w:i/>
-                <w:iCs/>
-                <w:sz w:val="16"/>
-                <w:szCs w:val="16"/>
-                <w:lang w:val="en-US"/>
-              </w:rPr>
-              <w:t>above, and</w:t>
-            </w:r>
-            <w:proofErr w:type="gramEnd"/>
-            <w:r>
-              <w:rPr>
-                <w:rFonts w:ascii="Calibri" w:hAnsi="Calibri" w:cs="Calibri"/>
-                <w:b/>
-                <w:bCs/>
-                <w:i/>
-                <w:iCs/>
-                <w:sz w:val="16"/>
-                <w:szCs w:val="16"/>
-                <w:lang w:val="en-US"/>
-              </w:rPr>
-              <w:t xml:space="preserve"> will only be reimbursed to the Client with original paid receipts.</w:t>
+              <w:t>** Payment of Tuition-related expenses will be paid to the Educational/Training institution named above, and will only be reimbursed to the Client with original paid receipts.</w:t>
             </w:r>
           </w:p>
           <w:p>
@@ -2515,7 +2487,7 @@
             <v:shape id="_x0000_i1028" type="#_x0000_t75" style="width:52.5pt;height:12.75pt" fillcolor="window">
               <v:imagedata r:id="rId1" o:title=""/>
             </v:shape>
-            <o:OLEObject Type="Embed" ProgID="Word.Picture.8" ShapeID="_x0000_i1028" DrawAspect="Content" ObjectID="_1825564196" r:id="rId2"/>
+            <o:OLEObject Type="Embed" ProgID="Word.Picture.8" ShapeID="_x0000_i1028" DrawAspect="Content" ObjectID="_1828345360" r:id="rId2"/>
           </w:object>
         </w:r>
       </w:p>
@@ -9753,26 +9725,10 @@
 </file>
 
 <file path=customXml/item1.xml><?xml version="1.0" encoding="utf-8"?>
-<p:properties xmlns:p="http://schemas.microsoft.com/office/2006/metadata/properties" xmlns:xsi="http://www.w3.org/2001/XMLSchema-instance" xmlns:pc="http://schemas.microsoft.com/office/infopath/2007/PartnerControls">
-  <documentManagement>
-    <TaxCatchAll xmlns="a5d83198-6f12-4e36-ab6c-c0620ad6e33d" xsi:nil="true"/>
-    <lcf76f155ced4ddcb4097134ff3c332f xmlns="2ce331cd-911c-49dc-ad11-a128166cb055">
-      <Terms xmlns="http://schemas.microsoft.com/office/infopath/2007/PartnerControls"/>
-    </lcf76f155ced4ddcb4097134ff3c332f>
-  </documentManagement>
-</p:properties>
+<b:Sources xmlns:b="http://schemas.openxmlformats.org/officeDocument/2006/bibliography" xmlns="http://schemas.openxmlformats.org/officeDocument/2006/bibliography" SelectedStyle="\APASixthEditionOfficeOnline.xsl" StyleName="APA" Version="6"/>
 </file>
 
 <file path=customXml/item2.xml><?xml version="1.0" encoding="utf-8"?>
-<?mso-contentType ?>
-<FormTemplates xmlns="http://schemas.microsoft.com/sharepoint/v3/contenttype/forms">
-  <Display>DocumentLibraryForm</Display>
-  <Edit>DocumentLibraryForm</Edit>
-  <New>DocumentLibraryForm</New>
-</FormTemplates>
-</file>
-
-<file path=customXml/item3.xml><?xml version="1.0" encoding="utf-8"?>
 <ct:contentTypeSchema xmlns:ct="http://schemas.microsoft.com/office/2006/metadata/contentType" xmlns:ma="http://schemas.microsoft.com/office/2006/metadata/properties/metaAttributes" ct:_="" ma:_="" ma:contentTypeName="Document" ma:contentTypeID="0x0101005C2BF0CAA6E74E4185253BE0451826C8" ma:contentTypeVersion="14" ma:contentTypeDescription="Create a new document." ma:contentTypeScope="" ma:versionID="fa57f4ca18ea88b38107f4c24f8cdb4e">
   <xsd:schema xmlns:xsd="http://www.w3.org/2001/XMLSchema" xmlns:xs="http://www.w3.org/2001/XMLSchema" xmlns:p="http://schemas.microsoft.com/office/2006/metadata/properties" xmlns:ns2="2ce331cd-911c-49dc-ad11-a128166cb055" xmlns:ns3="a5d83198-6f12-4e36-ab6c-c0620ad6e33d" targetNamespace="http://schemas.microsoft.com/office/2006/metadata/properties" ma:root="true" ma:fieldsID="8a0382e7bbeecfcf4c83d5ad6e8a9025" ns2:_="" ns3:_="">
     <xsd:import namespace="2ce331cd-911c-49dc-ad11-a128166cb055"/>
@@ -10001,30 +9957,35 @@
 </ct:contentTypeSchema>
 </file>
 
+<file path=customXml/item3.xml><?xml version="1.0" encoding="utf-8"?>
+<?mso-contentType ?>
+<FormTemplates xmlns="http://schemas.microsoft.com/sharepoint/v3/contenttype/forms">
+  <Display>DocumentLibraryForm</Display>
+  <Edit>DocumentLibraryForm</Edit>
+  <New>DocumentLibraryForm</New>
+</FormTemplates>
+</file>
+
 <file path=customXml/item4.xml><?xml version="1.0" encoding="utf-8"?>
-<b:Sources xmlns:b="http://schemas.openxmlformats.org/officeDocument/2006/bibliography" xmlns="http://schemas.openxmlformats.org/officeDocument/2006/bibliography" SelectedStyle="\APASixthEditionOfficeOnline.xsl" StyleName="APA" Version="6"/>
+<p:properties xmlns:p="http://schemas.microsoft.com/office/2006/metadata/properties" xmlns:xsi="http://www.w3.org/2001/XMLSchema-instance" xmlns:pc="http://schemas.microsoft.com/office/infopath/2007/PartnerControls">
+  <documentManagement>
+    <TaxCatchAll xmlns="a5d83198-6f12-4e36-ab6c-c0620ad6e33d" xsi:nil="true"/>
+    <lcf76f155ced4ddcb4097134ff3c332f xmlns="2ce331cd-911c-49dc-ad11-a128166cb055">
+      <Terms xmlns="http://schemas.microsoft.com/office/infopath/2007/PartnerControls"/>
+    </lcf76f155ced4ddcb4097134ff3c332f>
+  </documentManagement>
+</p:properties>
 </file>
 
 <file path=customXml/itemProps1.xml><?xml version="1.0" encoding="utf-8"?>
-<ds:datastoreItem xmlns:ds="http://schemas.openxmlformats.org/officeDocument/2006/customXml" ds:itemID="{1DC17039-8235-456F-BDEE-7332FF373E66}">
+<ds:datastoreItem xmlns:ds="http://schemas.openxmlformats.org/officeDocument/2006/customXml" ds:itemID="{D195FC2E-9414-491C-BF9A-0E84F5C369D8}">
   <ds:schemaRefs>
-    <ds:schemaRef ds:uri="http://schemas.microsoft.com/office/2006/metadata/properties"/>
-    <ds:schemaRef ds:uri="http://schemas.microsoft.com/office/infopath/2007/PartnerControls"/>
-    <ds:schemaRef ds:uri="a5d83198-6f12-4e36-ab6c-c0620ad6e33d"/>
-    <ds:schemaRef ds:uri="2ce331cd-911c-49dc-ad11-a128166cb055"/>
+    <ds:schemaRef ds:uri="http://schemas.openxmlformats.org/officeDocument/2006/bibliography"/>
   </ds:schemaRefs>
 </ds:datastoreItem>
 </file>
 
 <file path=customXml/itemProps2.xml><?xml version="1.0" encoding="utf-8"?>
-<ds:datastoreItem xmlns:ds="http://schemas.openxmlformats.org/officeDocument/2006/customXml" ds:itemID="{BC54765E-17AD-49D9-97D7-8BA7BCD14B81}">
-  <ds:schemaRefs>
-    <ds:schemaRef ds:uri="http://schemas.microsoft.com/sharepoint/v3/contenttype/forms"/>
-  </ds:schemaRefs>
-</ds:datastoreItem>
-</file>
-
-<file path=customXml/itemProps3.xml><?xml version="1.0" encoding="utf-8"?>
 <ds:datastoreItem xmlns:ds="http://schemas.openxmlformats.org/officeDocument/2006/customXml" ds:itemID="{25C4A434-4271-49FF-B447-E62C36BD0511}">
   <ds:schemaRefs>
     <ds:schemaRef ds:uri="http://schemas.microsoft.com/office/2006/metadata/contentType"/>
@@ -10043,10 +10004,21 @@
 </ds:datastoreItem>
 </file>
 
+<file path=customXml/itemProps3.xml><?xml version="1.0" encoding="utf-8"?>
+<ds:datastoreItem xmlns:ds="http://schemas.openxmlformats.org/officeDocument/2006/customXml" ds:itemID="{BC54765E-17AD-49D9-97D7-8BA7BCD14B81}">
+  <ds:schemaRefs>
+    <ds:schemaRef ds:uri="http://schemas.microsoft.com/sharepoint/v3/contenttype/forms"/>
+  </ds:schemaRefs>
+</ds:datastoreItem>
+</file>
+
 <file path=customXml/itemProps4.xml><?xml version="1.0" encoding="utf-8"?>
-<ds:datastoreItem xmlns:ds="http://schemas.openxmlformats.org/officeDocument/2006/customXml" ds:itemID="{D195FC2E-9414-491C-BF9A-0E84F5C369D8}">
+<ds:datastoreItem xmlns:ds="http://schemas.openxmlformats.org/officeDocument/2006/customXml" ds:itemID="{1DC17039-8235-456F-BDEE-7332FF373E66}">
   <ds:schemaRefs>
-    <ds:schemaRef ds:uri="http://schemas.openxmlformats.org/officeDocument/2006/bibliography"/>
+    <ds:schemaRef ds:uri="http://schemas.microsoft.com/office/2006/metadata/properties"/>
+    <ds:schemaRef ds:uri="http://schemas.microsoft.com/office/infopath/2007/PartnerControls"/>
+    <ds:schemaRef ds:uri="a5d83198-6f12-4e36-ab6c-c0620ad6e33d"/>
+    <ds:schemaRef ds:uri="2ce331cd-911c-49dc-ad11-a128166cb055"/>
   </ds:schemaRefs>
 </ds:datastoreItem>
 </file>
</xml_diff>